<commit_message>
SRV nabidka: kroky servisu s ikonami a sipkami, text o zpracovani nabidky
- "Jak probiha servis s Jurenka Elektro": 5 kroku vedle sebe zleva
  doprava, kazdy s vlastni ikonou (firemni modra), mezi kroky oranzove
  sipky smerujici k dalsimu kroku.
- Sekce "Proc Jurenka Elektro?" zrusena, misto ni kratky text
  "Zpracovani nabidky".
- Nadpisy drzi s nasledujicim obsahem (nezustanou osamocene na konci
  stranky), nabidka se tak vejde na 2 strany.

Co-Authored-By: Claude Opus 5.5 <noreply@anthropic.com>
Claude-Session: https://claude.ai/code/session_01HHfPVFWLgp3FgnzVf81wm5
</commit_message>
<xml_diff>
--- a/public/templates/nabidka_servis_sablona.docx
+++ b/public/templates/nabidka_servis_sablona.docx
@@ -103,6 +103,8 @@
     </w:p>
     <w:p>
       <w:pPr>
+        <w:keepNext/>
+        <w:keepLines/>
         <w:pBdr>
           <w:bottom w:val="single" w:color="E08A1E" w:sz="6" w:space="4"/>
         </w:pBdr>
@@ -117,85 +119,24 @@
           <w:sz w:val="24"/>
           <w:szCs w:val="24"/>
         </w:rPr>
-        <w:t xml:space="preserve">Proč Jurenka Elektro?</w:t>
+        <w:t xml:space="preserve">Zpracování nabídky</w:t>
       </w:r>
     </w:p>
     <w:p>
       <w:pPr>
-        <w:spacing w:after="60"/>
-        <w:ind w:left="316"/>
+        <w:spacing w:after="160" w:line="300"/>
       </w:pPr>
       <w:r>
         <w:rPr>
           <w:rFonts w:ascii="Calibri" w:cs="Calibri" w:eastAsia="Calibri" w:hAnsi="Calibri"/>
-          <w:b/>
-          <w:bCs/>
-          <w:color w:val="E08A1E"/>
         </w:rPr>
-        <w:t xml:space="preserve">— </w:t>
-      </w:r>
-      <w:r>
-        <w:rPr>
-          <w:rFonts w:ascii="Calibri" w:cs="Calibri" w:eastAsia="Calibri" w:hAnsi="Calibri"/>
-        </w:rPr>
-        <w:t xml:space="preserve">Elektroinstalace i fotovoltaiku děláme sami, ve vlastním týmu — bez přeprodávání subdodavatelům.</w:t>
+        <w:t xml:space="preserve">Nabídku jsme připravili podle Vašeho požadavku a údajů o Vaší fotovoltaické elektrárně. Najdete v ní popis servisovaného zařízení, cenu servisu a podmínky provedení. Pokud Vám nabídka vyhovuje, stačí ji potvrdit — domluvíme termín a servis provedeme. S případnými dotazy se na nás kdykoliv obraťte.</w:t>
       </w:r>
     </w:p>
     <w:p>
       <w:pPr>
-        <w:spacing w:after="60"/>
-        <w:ind w:left="316"/>
-      </w:pPr>
-      <w:r>
-        <w:rPr>
-          <w:rFonts w:ascii="Calibri" w:cs="Calibri" w:eastAsia="Calibri" w:hAnsi="Calibri"/>
-          <w:b/>
-          <w:bCs/>
-          <w:color w:val="E08A1E"/>
-        </w:rPr>
-        <w:t xml:space="preserve">— </w:t>
-      </w:r>
-      <w:r>
-        <w:rPr>
-          <w:rFonts w:ascii="Calibri" w:cs="Calibri" w:eastAsia="Calibri" w:hAnsi="Calibri"/>
-          <w:i/>
-          <w:iCs/>
-          <w:color w:val="5B6472"/>
-        </w:rPr>
-        <w:t xml:space="preserve">[doplňte: další silná stránka — certifikace, reference, roky zkušeností…]</w:t>
-      </w:r>
-    </w:p>
-    <w:p>
-      <w:pPr>
-        <w:spacing w:after="60"/>
-        <w:ind w:left="316"/>
-      </w:pPr>
-      <w:r>
-        <w:rPr>
-          <w:rFonts w:ascii="Calibri" w:cs="Calibri" w:eastAsia="Calibri" w:hAnsi="Calibri"/>
-          <w:b/>
-          <w:bCs/>
-          <w:color w:val="E08A1E"/>
-        </w:rPr>
-        <w:t xml:space="preserve">— </w:t>
-      </w:r>
-      <w:r>
-        <w:rPr>
-          <w:rFonts w:ascii="Calibri" w:cs="Calibri" w:eastAsia="Calibri" w:hAnsi="Calibri"/>
-          <w:i/>
-          <w:iCs/>
-          <w:color w:val="5B6472"/>
-        </w:rPr>
-        <w:t xml:space="preserve">[doplňte: další silná stránka]</w:t>
-      </w:r>
-    </w:p>
-    <w:p>
-      <w:r>
-        <w:br w:type="page"/>
-      </w:r>
-    </w:p>
-    <w:p>
-      <w:pPr>
+        <w:keepNext/>
+        <w:keepLines/>
         <w:pBdr>
           <w:bottom w:val="single" w:color="E08A1E" w:sz="6" w:space="4"/>
         </w:pBdr>
@@ -648,6 +589,8 @@
     </w:p>
     <w:p>
       <w:pPr>
+        <w:keepNext/>
+        <w:keepLines/>
         <w:pBdr>
           <w:bottom w:val="single" w:color="E08A1E" w:sz="6" w:space="4"/>
         </w:pBdr>
@@ -789,6 +732,8 @@
     </w:p>
     <w:p>
       <w:pPr>
+        <w:keepNext/>
+        <w:keepLines/>
         <w:pBdr>
           <w:bottom w:val="single" w:color="E08A1E" w:sz="6" w:space="4"/>
         </w:pBdr>
@@ -974,12 +919,9 @@
       </w:tr>
     </w:tbl>
     <w:p>
-      <w:r>
-        <w:br w:type="page"/>
-      </w:r>
-    </w:p>
-    <w:p>
       <w:pPr>
+        <w:keepNext/>
+        <w:keepLines/>
         <w:pBdr>
           <w:bottom w:val="single" w:color="E08A1E" w:sz="6" w:space="4"/>
         </w:pBdr>
@@ -1010,6 +952,8 @@
     </w:p>
     <w:p>
       <w:pPr>
+        <w:keepNext/>
+        <w:keepLines/>
         <w:pBdr>
           <w:bottom w:val="single" w:color="E08A1E" w:sz="6" w:space="4"/>
         </w:pBdr>
@@ -1204,6 +1148,8 @@
     </w:p>
     <w:p>
       <w:pPr>
+        <w:keepNext/>
+        <w:keepLines/>
         <w:pBdr>
           <w:bottom w:val="single" w:color="E08A1E" w:sz="6" w:space="4"/>
         </w:pBdr>
@@ -1221,126 +1167,717 @@
         <w:t xml:space="preserve">Jak probíhá servis s Jurenka Elektro</w:t>
       </w:r>
     </w:p>
-    <w:p>
-      <w:pPr>
-        <w:spacing w:after="70"/>
-        <w:ind w:left="316"/>
-      </w:pPr>
-      <w:r>
-        <w:rPr>
-          <w:rFonts w:ascii="Calibri" w:cs="Calibri" w:eastAsia="Calibri" w:hAnsi="Calibri"/>
-          <w:b/>
-          <w:bCs/>
-          <w:color w:val="E08A1E"/>
-        </w:rPr>
-        <w:t xml:space="preserve">1.  </w:t>
-      </w:r>
-      <w:r>
-        <w:rPr>
-          <w:rFonts w:ascii="Calibri" w:cs="Calibri" w:eastAsia="Calibri" w:hAnsi="Calibri"/>
-          <w:color w:val="1A1A1A"/>
-          <w:sz w:val="20"/>
-          <w:szCs w:val="20"/>
-        </w:rPr>
-        <w:t xml:space="preserve">Nahlášení požadavku a domluva termínu.</w:t>
-      </w:r>
-    </w:p>
-    <w:p>
-      <w:pPr>
-        <w:spacing w:after="70"/>
-        <w:ind w:left="316"/>
-      </w:pPr>
-      <w:r>
-        <w:rPr>
-          <w:rFonts w:ascii="Calibri" w:cs="Calibri" w:eastAsia="Calibri" w:hAnsi="Calibri"/>
-          <w:b/>
-          <w:bCs/>
-          <w:color w:val="E08A1E"/>
-        </w:rPr>
-        <w:t xml:space="preserve">2.  </w:t>
-      </w:r>
-      <w:r>
-        <w:rPr>
-          <w:rFonts w:ascii="Calibri" w:cs="Calibri" w:eastAsia="Calibri" w:hAnsi="Calibri"/>
-          <w:color w:val="1A1A1A"/>
-          <w:sz w:val="20"/>
-          <w:szCs w:val="20"/>
-        </w:rPr>
-        <w:t xml:space="preserve">Diagnostika nebo prohlídka na místě.</w:t>
-      </w:r>
-    </w:p>
-    <w:p>
-      <w:pPr>
-        <w:spacing w:after="70"/>
-        <w:ind w:left="316"/>
-      </w:pPr>
-      <w:r>
-        <w:rPr>
-          <w:rFonts w:ascii="Calibri" w:cs="Calibri" w:eastAsia="Calibri" w:hAnsi="Calibri"/>
-          <w:b/>
-          <w:bCs/>
-          <w:color w:val="E08A1E"/>
-        </w:rPr>
-        <w:t xml:space="preserve">3.  </w:t>
-      </w:r>
-      <w:r>
-        <w:rPr>
-          <w:rFonts w:ascii="Calibri" w:cs="Calibri" w:eastAsia="Calibri" w:hAnsi="Calibri"/>
-          <w:color w:val="1A1A1A"/>
-          <w:sz w:val="20"/>
-          <w:szCs w:val="20"/>
-        </w:rPr>
-        <w:t xml:space="preserve">Nabídka na servis nebo opravu — tento dokument.</w:t>
-      </w:r>
-    </w:p>
-    <w:p>
-      <w:pPr>
-        <w:spacing w:after="70"/>
-        <w:ind w:left="316"/>
-      </w:pPr>
-      <w:r>
-        <w:rPr>
-          <w:rFonts w:ascii="Calibri" w:cs="Calibri" w:eastAsia="Calibri" w:hAnsi="Calibri"/>
-          <w:b/>
-          <w:bCs/>
-          <w:color w:val="E08A1E"/>
-        </w:rPr>
-        <w:t xml:space="preserve">4.  </w:t>
-      </w:r>
-      <w:r>
-        <w:rPr>
-          <w:rFonts w:ascii="Calibri" w:cs="Calibri" w:eastAsia="Calibri" w:hAnsi="Calibri"/>
-          <w:color w:val="1A1A1A"/>
-          <w:sz w:val="20"/>
-          <w:szCs w:val="20"/>
-        </w:rPr>
-        <w:t xml:space="preserve">Odsouhlasení nabídky.</w:t>
-      </w:r>
-    </w:p>
-    <w:p>
-      <w:pPr>
-        <w:spacing w:after="70"/>
-        <w:ind w:left="316"/>
-      </w:pPr>
-      <w:r>
-        <w:rPr>
-          <w:rFonts w:ascii="Calibri" w:cs="Calibri" w:eastAsia="Calibri" w:hAnsi="Calibri"/>
-          <w:b/>
-          <w:bCs/>
-          <w:color w:val="E08A1E"/>
-        </w:rPr>
-        <w:t xml:space="preserve">5.  </w:t>
-      </w:r>
-      <w:r>
-        <w:rPr>
-          <w:rFonts w:ascii="Calibri" w:cs="Calibri" w:eastAsia="Calibri" w:hAnsi="Calibri"/>
-          <w:color w:val="1A1A1A"/>
-          <w:sz w:val="20"/>
-          <w:szCs w:val="20"/>
-        </w:rPr>
-        <w:t xml:space="preserve">Provedení servisu a předání.</w:t>
-      </w:r>
-    </w:p>
+    <w:tbl>
+      <w:tblPr>
+        <w:tblW w:type="dxa" w:w="10204"/>
+        <w:tblBorders>
+          <w:top w:val="none"/>
+          <w:left w:val="none"/>
+          <w:bottom w:val="none"/>
+          <w:right w:val="none"/>
+          <w:insideH w:val="none"/>
+          <w:insideV w:val="none"/>
+        </w:tblBorders>
+      </w:tblPr>
+      <w:tblGrid>
+        <w:gridCol w:w="1700"/>
+        <w:gridCol w:w="426"/>
+        <w:gridCol w:w="1700"/>
+        <w:gridCol w:w="426"/>
+        <w:gridCol w:w="1700"/>
+        <w:gridCol w:w="426"/>
+        <w:gridCol w:w="1700"/>
+        <w:gridCol w:w="426"/>
+        <w:gridCol w:w="1700"/>
+      </w:tblGrid>
+      <w:tr>
+        <w:trPr>
+          <w:cantSplit/>
+        </w:trPr>
+        <w:tc>
+          <w:tcPr>
+            <w:tcW w:type="dxa" w:w="1700"/>
+            <w:tcMar>
+              <w:top w:type="dxa" w:w="60"/>
+              <w:left w:type="dxa" w:w="40"/>
+              <w:bottom w:type="dxa" w:w="60"/>
+              <w:right w:type="dxa" w:w="40"/>
+            </w:tcMar>
+            <w:vAlign w:val="top"/>
+          </w:tcPr>
+          <w:p>
+            <w:pPr>
+              <w:spacing w:after="60"/>
+              <w:jc w:val="center"/>
+            </w:pPr>
+            <w:r>
+              <w:drawing>
+                <wp:inline distT="0" distB="0" distL="0" distR="0">
+                  <wp:extent cx="514350" cy="514350"/>
+                  <wp:effectExtent t="0" r="0" b="0" l="0"/>
+                  <wp:docPr id="1000" name="" descr="" title=""/>
+                  <wp:cNvGraphicFramePr>
+                    <a:graphicFrameLocks xmlns:a="http://schemas.openxmlformats.org/drawingml/2006/main" noChangeAspect="1"/>
+                  </wp:cNvGraphicFramePr>
+                  <a:graphic xmlns:a="http://schemas.openxmlformats.org/drawingml/2006/main">
+                    <a:graphicData uri="http://schemas.openxmlformats.org/drawingml/2006/picture">
+                      <pic:pic xmlns:pic="http://schemas.openxmlformats.org/drawingml/2006/picture">
+                        <pic:nvPicPr>
+                          <pic:cNvPr id="0" name="" descr=""/>
+                          <pic:cNvPicPr>
+                            <a:picLocks noChangeAspect="1" noChangeArrowheads="1"/>
+                          </pic:cNvPicPr>
+                        </pic:nvPicPr>
+                        <pic:blipFill>
+                          <a:blip r:embed="rIdServis6" cstate="none"/>
+                          <a:srcRect/>
+                          <a:stretch>
+                            <a:fillRect/>
+                          </a:stretch>
+                        </pic:blipFill>
+                        <pic:spPr bwMode="auto">
+                          <a:xfrm>
+                            <a:off x="0" y="0"/>
+                            <a:ext cx="514350" cy="514350"/>
+                          </a:xfrm>
+                          <a:prstGeom prst="rect">
+                            <a:avLst/>
+                          </a:prstGeom>
+                        </pic:spPr>
+                      </pic:pic>
+                    </a:graphicData>
+                  </a:graphic>
+                </wp:inline>
+              </w:drawing>
+            </w:r>
+          </w:p>
+          <w:p>
+            <w:pPr>
+              <w:spacing w:after="40"/>
+              <w:jc w:val="center"/>
+            </w:pPr>
+            <w:r>
+              <w:rPr>
+                <w:rFonts w:ascii="Calibri" w:cs="Calibri" w:eastAsia="Calibri" w:hAnsi="Calibri"/>
+                <w:b/>
+                <w:bCs/>
+                <w:color w:val="E08A1E"/>
+                <w:sz w:val="16"/>
+                <w:szCs w:val="16"/>
+              </w:rPr>
+              <w:t xml:space="preserve">KROK 1</w:t>
+            </w:r>
+          </w:p>
+          <w:p>
+            <w:pPr>
+              <w:spacing w:after="0" w:line="260"/>
+              <w:jc w:val="center"/>
+            </w:pPr>
+            <w:r>
+              <w:rPr>
+                <w:rFonts w:ascii="Calibri" w:cs="Calibri" w:eastAsia="Calibri" w:hAnsi="Calibri"/>
+                <w:color w:val="1A1A1A"/>
+                <w:sz w:val="18"/>
+                <w:szCs w:val="18"/>
+              </w:rPr>
+              <w:t xml:space="preserve">Nahlášení požadavku a domluva termínu</w:t>
+            </w:r>
+          </w:p>
+        </w:tc>
+        <w:tc>
+          <w:tcPr>
+            <w:tcW w:type="dxa" w:w="426"/>
+            <w:tcMar>
+              <w:top w:type="dxa" w:w="60"/>
+              <w:left w:type="dxa" w:w="0"/>
+              <w:bottom w:type="dxa" w:w="60"/>
+              <w:right w:type="dxa" w:w="0"/>
+            </w:tcMar>
+            <w:vAlign w:val="top"/>
+          </w:tcPr>
+          <w:p>
+            <w:pPr>
+              <w:spacing w:after="0" w:before="320"/>
+              <w:jc w:val="center"/>
+            </w:pPr>
+            <w:r>
+              <w:drawing>
+                <wp:inline distT="0" distB="0" distL="0" distR="0">
+                  <wp:extent cx="247650" cy="123825"/>
+                  <wp:effectExtent t="0" r="0" b="0" l="0"/>
+                  <wp:docPr id="1001" name="" descr="" title=""/>
+                  <wp:cNvGraphicFramePr>
+                    <a:graphicFrameLocks xmlns:a="http://schemas.openxmlformats.org/drawingml/2006/main" noChangeAspect="1"/>
+                  </wp:cNvGraphicFramePr>
+                  <a:graphic xmlns:a="http://schemas.openxmlformats.org/drawingml/2006/main">
+                    <a:graphicData uri="http://schemas.openxmlformats.org/drawingml/2006/picture">
+                      <pic:pic xmlns:pic="http://schemas.openxmlformats.org/drawingml/2006/picture">
+                        <pic:nvPicPr>
+                          <pic:cNvPr id="0" name="" descr=""/>
+                          <pic:cNvPicPr>
+                            <a:picLocks noChangeAspect="1" noChangeArrowheads="1"/>
+                          </pic:cNvPicPr>
+                        </pic:nvPicPr>
+                        <pic:blipFill>
+                          <a:blip r:embed="rIdServis1" cstate="none"/>
+                          <a:srcRect/>
+                          <a:stretch>
+                            <a:fillRect/>
+                          </a:stretch>
+                        </pic:blipFill>
+                        <pic:spPr bwMode="auto">
+                          <a:xfrm>
+                            <a:off x="0" y="0"/>
+                            <a:ext cx="247650" cy="123825"/>
+                          </a:xfrm>
+                          <a:prstGeom prst="rect">
+                            <a:avLst/>
+                          </a:prstGeom>
+                        </pic:spPr>
+                      </pic:pic>
+                    </a:graphicData>
+                  </a:graphic>
+                </wp:inline>
+              </w:drawing>
+            </w:r>
+          </w:p>
+        </w:tc>
+        <w:tc>
+          <w:tcPr>
+            <w:tcW w:type="dxa" w:w="1700"/>
+            <w:tcMar>
+              <w:top w:type="dxa" w:w="60"/>
+              <w:left w:type="dxa" w:w="40"/>
+              <w:bottom w:type="dxa" w:w="60"/>
+              <w:right w:type="dxa" w:w="40"/>
+            </w:tcMar>
+            <w:vAlign w:val="top"/>
+          </w:tcPr>
+          <w:p>
+            <w:pPr>
+              <w:spacing w:after="60"/>
+              <w:jc w:val="center"/>
+            </w:pPr>
+            <w:r>
+              <w:drawing>
+                <wp:inline distT="0" distB="0" distL="0" distR="0">
+                  <wp:extent cx="514350" cy="514350"/>
+                  <wp:effectExtent t="0" r="0" b="0" l="0"/>
+                  <wp:docPr id="1002" name="" descr="" title=""/>
+                  <wp:cNvGraphicFramePr>
+                    <a:graphicFrameLocks xmlns:a="http://schemas.openxmlformats.org/drawingml/2006/main" noChangeAspect="1"/>
+                  </wp:cNvGraphicFramePr>
+                  <a:graphic xmlns:a="http://schemas.openxmlformats.org/drawingml/2006/main">
+                    <a:graphicData uri="http://schemas.openxmlformats.org/drawingml/2006/picture">
+                      <pic:pic xmlns:pic="http://schemas.openxmlformats.org/drawingml/2006/picture">
+                        <pic:nvPicPr>
+                          <pic:cNvPr id="0" name="" descr=""/>
+                          <pic:cNvPicPr>
+                            <a:picLocks noChangeAspect="1" noChangeArrowheads="1"/>
+                          </pic:cNvPicPr>
+                        </pic:nvPicPr>
+                        <pic:blipFill>
+                          <a:blip r:embed="rIdServis2" cstate="none"/>
+                          <a:srcRect/>
+                          <a:stretch>
+                            <a:fillRect/>
+                          </a:stretch>
+                        </pic:blipFill>
+                        <pic:spPr bwMode="auto">
+                          <a:xfrm>
+                            <a:off x="0" y="0"/>
+                            <a:ext cx="514350" cy="514350"/>
+                          </a:xfrm>
+                          <a:prstGeom prst="rect">
+                            <a:avLst/>
+                          </a:prstGeom>
+                        </pic:spPr>
+                      </pic:pic>
+                    </a:graphicData>
+                  </a:graphic>
+                </wp:inline>
+              </w:drawing>
+            </w:r>
+          </w:p>
+          <w:p>
+            <w:pPr>
+              <w:spacing w:after="40"/>
+              <w:jc w:val="center"/>
+            </w:pPr>
+            <w:r>
+              <w:rPr>
+                <w:rFonts w:ascii="Calibri" w:cs="Calibri" w:eastAsia="Calibri" w:hAnsi="Calibri"/>
+                <w:b/>
+                <w:bCs/>
+                <w:color w:val="E08A1E"/>
+                <w:sz w:val="16"/>
+                <w:szCs w:val="16"/>
+              </w:rPr>
+              <w:t xml:space="preserve">KROK 2</w:t>
+            </w:r>
+          </w:p>
+          <w:p>
+            <w:pPr>
+              <w:spacing w:after="0" w:line="260"/>
+              <w:jc w:val="center"/>
+            </w:pPr>
+            <w:r>
+              <w:rPr>
+                <w:rFonts w:ascii="Calibri" w:cs="Calibri" w:eastAsia="Calibri" w:hAnsi="Calibri"/>
+                <w:color w:val="1A1A1A"/>
+                <w:sz w:val="18"/>
+                <w:szCs w:val="18"/>
+              </w:rPr>
+              <w:t xml:space="preserve">Diagnostika nebo prohlídka na místě</w:t>
+            </w:r>
+          </w:p>
+        </w:tc>
+        <w:tc>
+          <w:tcPr>
+            <w:tcW w:type="dxa" w:w="426"/>
+            <w:tcMar>
+              <w:top w:type="dxa" w:w="60"/>
+              <w:left w:type="dxa" w:w="0"/>
+              <w:bottom w:type="dxa" w:w="60"/>
+              <w:right w:type="dxa" w:w="0"/>
+            </w:tcMar>
+            <w:vAlign w:val="top"/>
+          </w:tcPr>
+          <w:p>
+            <w:pPr>
+              <w:spacing w:after="0" w:before="320"/>
+              <w:jc w:val="center"/>
+            </w:pPr>
+            <w:r>
+              <w:drawing>
+                <wp:inline distT="0" distB="0" distL="0" distR="0">
+                  <wp:extent cx="247650" cy="123825"/>
+                  <wp:effectExtent t="0" r="0" b="0" l="0"/>
+                  <wp:docPr id="1003" name="" descr="" title=""/>
+                  <wp:cNvGraphicFramePr>
+                    <a:graphicFrameLocks xmlns:a="http://schemas.openxmlformats.org/drawingml/2006/main" noChangeAspect="1"/>
+                  </wp:cNvGraphicFramePr>
+                  <a:graphic xmlns:a="http://schemas.openxmlformats.org/drawingml/2006/main">
+                    <a:graphicData uri="http://schemas.openxmlformats.org/drawingml/2006/picture">
+                      <pic:pic xmlns:pic="http://schemas.openxmlformats.org/drawingml/2006/picture">
+                        <pic:nvPicPr>
+                          <pic:cNvPr id="0" name="" descr=""/>
+                          <pic:cNvPicPr>
+                            <a:picLocks noChangeAspect="1" noChangeArrowheads="1"/>
+                          </pic:cNvPicPr>
+                        </pic:nvPicPr>
+                        <pic:blipFill>
+                          <a:blip r:embed="rIdServis1" cstate="none"/>
+                          <a:srcRect/>
+                          <a:stretch>
+                            <a:fillRect/>
+                          </a:stretch>
+                        </pic:blipFill>
+                        <pic:spPr bwMode="auto">
+                          <a:xfrm>
+                            <a:off x="0" y="0"/>
+                            <a:ext cx="247650" cy="123825"/>
+                          </a:xfrm>
+                          <a:prstGeom prst="rect">
+                            <a:avLst/>
+                          </a:prstGeom>
+                        </pic:spPr>
+                      </pic:pic>
+                    </a:graphicData>
+                  </a:graphic>
+                </wp:inline>
+              </w:drawing>
+            </w:r>
+          </w:p>
+        </w:tc>
+        <w:tc>
+          <w:tcPr>
+            <w:tcW w:type="dxa" w:w="1700"/>
+            <w:tcMar>
+              <w:top w:type="dxa" w:w="60"/>
+              <w:left w:type="dxa" w:w="40"/>
+              <w:bottom w:type="dxa" w:w="60"/>
+              <w:right w:type="dxa" w:w="40"/>
+            </w:tcMar>
+            <w:vAlign w:val="top"/>
+          </w:tcPr>
+          <w:p>
+            <w:pPr>
+              <w:spacing w:after="60"/>
+              <w:jc w:val="center"/>
+            </w:pPr>
+            <w:r>
+              <w:drawing>
+                <wp:inline distT="0" distB="0" distL="0" distR="0">
+                  <wp:extent cx="514350" cy="514350"/>
+                  <wp:effectExtent t="0" r="0" b="0" l="0"/>
+                  <wp:docPr id="1004" name="" descr="" title=""/>
+                  <wp:cNvGraphicFramePr>
+                    <a:graphicFrameLocks xmlns:a="http://schemas.openxmlformats.org/drawingml/2006/main" noChangeAspect="1"/>
+                  </wp:cNvGraphicFramePr>
+                  <a:graphic xmlns:a="http://schemas.openxmlformats.org/drawingml/2006/main">
+                    <a:graphicData uri="http://schemas.openxmlformats.org/drawingml/2006/picture">
+                      <pic:pic xmlns:pic="http://schemas.openxmlformats.org/drawingml/2006/picture">
+                        <pic:nvPicPr>
+                          <pic:cNvPr id="0" name="" descr=""/>
+                          <pic:cNvPicPr>
+                            <a:picLocks noChangeAspect="1" noChangeArrowheads="1"/>
+                          </pic:cNvPicPr>
+                        </pic:nvPicPr>
+                        <pic:blipFill>
+                          <a:blip r:embed="rIdServis3" cstate="none"/>
+                          <a:srcRect/>
+                          <a:stretch>
+                            <a:fillRect/>
+                          </a:stretch>
+                        </pic:blipFill>
+                        <pic:spPr bwMode="auto">
+                          <a:xfrm>
+                            <a:off x="0" y="0"/>
+                            <a:ext cx="514350" cy="514350"/>
+                          </a:xfrm>
+                          <a:prstGeom prst="rect">
+                            <a:avLst/>
+                          </a:prstGeom>
+                        </pic:spPr>
+                      </pic:pic>
+                    </a:graphicData>
+                  </a:graphic>
+                </wp:inline>
+              </w:drawing>
+            </w:r>
+          </w:p>
+          <w:p>
+            <w:pPr>
+              <w:spacing w:after="40"/>
+              <w:jc w:val="center"/>
+            </w:pPr>
+            <w:r>
+              <w:rPr>
+                <w:rFonts w:ascii="Calibri" w:cs="Calibri" w:eastAsia="Calibri" w:hAnsi="Calibri"/>
+                <w:b/>
+                <w:bCs/>
+                <w:color w:val="E08A1E"/>
+                <w:sz w:val="16"/>
+                <w:szCs w:val="16"/>
+              </w:rPr>
+              <w:t xml:space="preserve">KROK 3</w:t>
+            </w:r>
+          </w:p>
+          <w:p>
+            <w:pPr>
+              <w:spacing w:after="0" w:line="260"/>
+              <w:jc w:val="center"/>
+            </w:pPr>
+            <w:r>
+              <w:rPr>
+                <w:rFonts w:ascii="Calibri" w:cs="Calibri" w:eastAsia="Calibri" w:hAnsi="Calibri"/>
+                <w:color w:val="1A1A1A"/>
+                <w:sz w:val="18"/>
+                <w:szCs w:val="18"/>
+              </w:rPr>
+              <w:t xml:space="preserve">Nabídka na servis (tento dokument)</w:t>
+            </w:r>
+          </w:p>
+        </w:tc>
+        <w:tc>
+          <w:tcPr>
+            <w:tcW w:type="dxa" w:w="426"/>
+            <w:tcMar>
+              <w:top w:type="dxa" w:w="60"/>
+              <w:left w:type="dxa" w:w="0"/>
+              <w:bottom w:type="dxa" w:w="60"/>
+              <w:right w:type="dxa" w:w="0"/>
+            </w:tcMar>
+            <w:vAlign w:val="top"/>
+          </w:tcPr>
+          <w:p>
+            <w:pPr>
+              <w:spacing w:after="0" w:before="320"/>
+              <w:jc w:val="center"/>
+            </w:pPr>
+            <w:r>
+              <w:drawing>
+                <wp:inline distT="0" distB="0" distL="0" distR="0">
+                  <wp:extent cx="247650" cy="123825"/>
+                  <wp:effectExtent t="0" r="0" b="0" l="0"/>
+                  <wp:docPr id="1005" name="" descr="" title=""/>
+                  <wp:cNvGraphicFramePr>
+                    <a:graphicFrameLocks xmlns:a="http://schemas.openxmlformats.org/drawingml/2006/main" noChangeAspect="1"/>
+                  </wp:cNvGraphicFramePr>
+                  <a:graphic xmlns:a="http://schemas.openxmlformats.org/drawingml/2006/main">
+                    <a:graphicData uri="http://schemas.openxmlformats.org/drawingml/2006/picture">
+                      <pic:pic xmlns:pic="http://schemas.openxmlformats.org/drawingml/2006/picture">
+                        <pic:nvPicPr>
+                          <pic:cNvPr id="0" name="" descr=""/>
+                          <pic:cNvPicPr>
+                            <a:picLocks noChangeAspect="1" noChangeArrowheads="1"/>
+                          </pic:cNvPicPr>
+                        </pic:nvPicPr>
+                        <pic:blipFill>
+                          <a:blip r:embed="rIdServis1" cstate="none"/>
+                          <a:srcRect/>
+                          <a:stretch>
+                            <a:fillRect/>
+                          </a:stretch>
+                        </pic:blipFill>
+                        <pic:spPr bwMode="auto">
+                          <a:xfrm>
+                            <a:off x="0" y="0"/>
+                            <a:ext cx="247650" cy="123825"/>
+                          </a:xfrm>
+                          <a:prstGeom prst="rect">
+                            <a:avLst/>
+                          </a:prstGeom>
+                        </pic:spPr>
+                      </pic:pic>
+                    </a:graphicData>
+                  </a:graphic>
+                </wp:inline>
+              </w:drawing>
+            </w:r>
+          </w:p>
+        </w:tc>
+        <w:tc>
+          <w:tcPr>
+            <w:tcW w:type="dxa" w:w="1700"/>
+            <w:tcMar>
+              <w:top w:type="dxa" w:w="60"/>
+              <w:left w:type="dxa" w:w="40"/>
+              <w:bottom w:type="dxa" w:w="60"/>
+              <w:right w:type="dxa" w:w="40"/>
+            </w:tcMar>
+            <w:vAlign w:val="top"/>
+          </w:tcPr>
+          <w:p>
+            <w:pPr>
+              <w:spacing w:after="60"/>
+              <w:jc w:val="center"/>
+            </w:pPr>
+            <w:r>
+              <w:drawing>
+                <wp:inline distT="0" distB="0" distL="0" distR="0">
+                  <wp:extent cx="514350" cy="514350"/>
+                  <wp:effectExtent t="0" r="0" b="0" l="0"/>
+                  <wp:docPr id="1006" name="" descr="" title=""/>
+                  <wp:cNvGraphicFramePr>
+                    <a:graphicFrameLocks xmlns:a="http://schemas.openxmlformats.org/drawingml/2006/main" noChangeAspect="1"/>
+                  </wp:cNvGraphicFramePr>
+                  <a:graphic xmlns:a="http://schemas.openxmlformats.org/drawingml/2006/main">
+                    <a:graphicData uri="http://schemas.openxmlformats.org/drawingml/2006/picture">
+                      <pic:pic xmlns:pic="http://schemas.openxmlformats.org/drawingml/2006/picture">
+                        <pic:nvPicPr>
+                          <pic:cNvPr id="0" name="" descr=""/>
+                          <pic:cNvPicPr>
+                            <a:picLocks noChangeAspect="1" noChangeArrowheads="1"/>
+                          </pic:cNvPicPr>
+                        </pic:nvPicPr>
+                        <pic:blipFill>
+                          <a:blip r:embed="rIdServis4" cstate="none"/>
+                          <a:srcRect/>
+                          <a:stretch>
+                            <a:fillRect/>
+                          </a:stretch>
+                        </pic:blipFill>
+                        <pic:spPr bwMode="auto">
+                          <a:xfrm>
+                            <a:off x="0" y="0"/>
+                            <a:ext cx="514350" cy="514350"/>
+                          </a:xfrm>
+                          <a:prstGeom prst="rect">
+                            <a:avLst/>
+                          </a:prstGeom>
+                        </pic:spPr>
+                      </pic:pic>
+                    </a:graphicData>
+                  </a:graphic>
+                </wp:inline>
+              </w:drawing>
+            </w:r>
+          </w:p>
+          <w:p>
+            <w:pPr>
+              <w:spacing w:after="40"/>
+              <w:jc w:val="center"/>
+            </w:pPr>
+            <w:r>
+              <w:rPr>
+                <w:rFonts w:ascii="Calibri" w:cs="Calibri" w:eastAsia="Calibri" w:hAnsi="Calibri"/>
+                <w:b/>
+                <w:bCs/>
+                <w:color w:val="E08A1E"/>
+                <w:sz w:val="16"/>
+                <w:szCs w:val="16"/>
+              </w:rPr>
+              <w:t xml:space="preserve">KROK 4</w:t>
+            </w:r>
+          </w:p>
+          <w:p>
+            <w:pPr>
+              <w:spacing w:after="0" w:line="260"/>
+              <w:jc w:val="center"/>
+            </w:pPr>
+            <w:r>
+              <w:rPr>
+                <w:rFonts w:ascii="Calibri" w:cs="Calibri" w:eastAsia="Calibri" w:hAnsi="Calibri"/>
+                <w:color w:val="1A1A1A"/>
+                <w:sz w:val="18"/>
+                <w:szCs w:val="18"/>
+              </w:rPr>
+              <w:t xml:space="preserve">Odsouhlasení nabídky</w:t>
+            </w:r>
+          </w:p>
+        </w:tc>
+        <w:tc>
+          <w:tcPr>
+            <w:tcW w:type="dxa" w:w="426"/>
+            <w:tcMar>
+              <w:top w:type="dxa" w:w="60"/>
+              <w:left w:type="dxa" w:w="0"/>
+              <w:bottom w:type="dxa" w:w="60"/>
+              <w:right w:type="dxa" w:w="0"/>
+            </w:tcMar>
+            <w:vAlign w:val="top"/>
+          </w:tcPr>
+          <w:p>
+            <w:pPr>
+              <w:spacing w:after="0" w:before="320"/>
+              <w:jc w:val="center"/>
+            </w:pPr>
+            <w:r>
+              <w:drawing>
+                <wp:inline distT="0" distB="0" distL="0" distR="0">
+                  <wp:extent cx="247650" cy="123825"/>
+                  <wp:effectExtent t="0" r="0" b="0" l="0"/>
+                  <wp:docPr id="1007" name="" descr="" title=""/>
+                  <wp:cNvGraphicFramePr>
+                    <a:graphicFrameLocks xmlns:a="http://schemas.openxmlformats.org/drawingml/2006/main" noChangeAspect="1"/>
+                  </wp:cNvGraphicFramePr>
+                  <a:graphic xmlns:a="http://schemas.openxmlformats.org/drawingml/2006/main">
+                    <a:graphicData uri="http://schemas.openxmlformats.org/drawingml/2006/picture">
+                      <pic:pic xmlns:pic="http://schemas.openxmlformats.org/drawingml/2006/picture">
+                        <pic:nvPicPr>
+                          <pic:cNvPr id="0" name="" descr=""/>
+                          <pic:cNvPicPr>
+                            <a:picLocks noChangeAspect="1" noChangeArrowheads="1"/>
+                          </pic:cNvPicPr>
+                        </pic:nvPicPr>
+                        <pic:blipFill>
+                          <a:blip r:embed="rIdServis1" cstate="none"/>
+                          <a:srcRect/>
+                          <a:stretch>
+                            <a:fillRect/>
+                          </a:stretch>
+                        </pic:blipFill>
+                        <pic:spPr bwMode="auto">
+                          <a:xfrm>
+                            <a:off x="0" y="0"/>
+                            <a:ext cx="247650" cy="123825"/>
+                          </a:xfrm>
+                          <a:prstGeom prst="rect">
+                            <a:avLst/>
+                          </a:prstGeom>
+                        </pic:spPr>
+                      </pic:pic>
+                    </a:graphicData>
+                  </a:graphic>
+                </wp:inline>
+              </w:drawing>
+            </w:r>
+          </w:p>
+        </w:tc>
+        <w:tc>
+          <w:tcPr>
+            <w:tcW w:type="dxa" w:w="1700"/>
+            <w:tcMar>
+              <w:top w:type="dxa" w:w="60"/>
+              <w:left w:type="dxa" w:w="40"/>
+              <w:bottom w:type="dxa" w:w="60"/>
+              <w:right w:type="dxa" w:w="40"/>
+            </w:tcMar>
+            <w:vAlign w:val="top"/>
+          </w:tcPr>
+          <w:p>
+            <w:pPr>
+              <w:spacing w:after="60"/>
+              <w:jc w:val="center"/>
+            </w:pPr>
+            <w:r>
+              <w:drawing>
+                <wp:inline distT="0" distB="0" distL="0" distR="0">
+                  <wp:extent cx="514350" cy="514350"/>
+                  <wp:effectExtent t="0" r="0" b="0" l="0"/>
+                  <wp:docPr id="1008" name="" descr="" title=""/>
+                  <wp:cNvGraphicFramePr>
+                    <a:graphicFrameLocks xmlns:a="http://schemas.openxmlformats.org/drawingml/2006/main" noChangeAspect="1"/>
+                  </wp:cNvGraphicFramePr>
+                  <a:graphic xmlns:a="http://schemas.openxmlformats.org/drawingml/2006/main">
+                    <a:graphicData uri="http://schemas.openxmlformats.org/drawingml/2006/picture">
+                      <pic:pic xmlns:pic="http://schemas.openxmlformats.org/drawingml/2006/picture">
+                        <pic:nvPicPr>
+                          <pic:cNvPr id="0" name="" descr=""/>
+                          <pic:cNvPicPr>
+                            <a:picLocks noChangeAspect="1" noChangeArrowheads="1"/>
+                          </pic:cNvPicPr>
+                        </pic:nvPicPr>
+                        <pic:blipFill>
+                          <a:blip r:embed="rIdServis5" cstate="none"/>
+                          <a:srcRect/>
+                          <a:stretch>
+                            <a:fillRect/>
+                          </a:stretch>
+                        </pic:blipFill>
+                        <pic:spPr bwMode="auto">
+                          <a:xfrm>
+                            <a:off x="0" y="0"/>
+                            <a:ext cx="514350" cy="514350"/>
+                          </a:xfrm>
+                          <a:prstGeom prst="rect">
+                            <a:avLst/>
+                          </a:prstGeom>
+                        </pic:spPr>
+                      </pic:pic>
+                    </a:graphicData>
+                  </a:graphic>
+                </wp:inline>
+              </w:drawing>
+            </w:r>
+          </w:p>
+          <w:p>
+            <w:pPr>
+              <w:spacing w:after="40"/>
+              <w:jc w:val="center"/>
+            </w:pPr>
+            <w:r>
+              <w:rPr>
+                <w:rFonts w:ascii="Calibri" w:cs="Calibri" w:eastAsia="Calibri" w:hAnsi="Calibri"/>
+                <w:b/>
+                <w:bCs/>
+                <w:color w:val="E08A1E"/>
+                <w:sz w:val="16"/>
+                <w:szCs w:val="16"/>
+              </w:rPr>
+              <w:t xml:space="preserve">KROK 5</w:t>
+            </w:r>
+          </w:p>
+          <w:p>
+            <w:pPr>
+              <w:spacing w:after="0" w:line="260"/>
+              <w:jc w:val="center"/>
+            </w:pPr>
+            <w:r>
+              <w:rPr>
+                <w:rFonts w:ascii="Calibri" w:cs="Calibri" w:eastAsia="Calibri" w:hAnsi="Calibri"/>
+                <w:color w:val="1A1A1A"/>
+                <w:sz w:val="18"/>
+                <w:szCs w:val="18"/>
+              </w:rPr>
+              <w:t xml:space="preserve">Provedení servisu a předání</w:t>
+            </w:r>
+          </w:p>
+        </w:tc>
+      </w:tr>
+    </w:tbl>
     <w:sectPr>
       <w:headerReference w:type="default" r:id="rId10"/>
       <w:footerReference w:type="default" r:id="rId11"/>

</xml_diff>

<commit_message>
Nabidka SRV/FVR: specifikace podle typu (servis = stavajici soustava, rozsireni = co se pridava)
- Servisni sablona je ted spolecna pro SRV i FVR; nadpis, podnadpis,
  uvod, text o zpracovani, nadpis specifikace a kroky postupu se plni
  podle typu (nove src/nabidkaTexty.js).
- Specifikace je smycka radku: jen komponenty s mnozstvim > 0 (vc.
  vlastnich radku). U SRV popisuje stavajici soustavu pro revizi,
  diagnostiku a cisteni panelu, u FVR vypisuje, co se pridava, vc.
  pridaneho vykonu. Kdyz neni zadano nic, je tam "[doplnit]".
- U SRV nove zaskrtavatka "Druh servisu" (revize / diagnostika /
  cisteni FVE panelu), promitaji se do nadpisu a uvodu nabidky.
- U FVR tlacitko "Vygenerovat nabidku rozsireni (Word)" a napoveda,
  ze se do materialu zadava jen to, co se pridava.

Co-Authored-By: Claude Opus 5.5 <noreply@anthropic.com>
Claude-Session: https://claude.ai/code/session_01HHfPVFWLgp3FgnzVf81wm5
</commit_message>
<xml_diff>
--- a/public/templates/nabidka_servis_sablona.docx
+++ b/public/templates/nabidka_servis_sablona.docx
@@ -15,7 +15,7 @@
           <w:sz w:val="40"/>
           <w:szCs w:val="40"/>
         </w:rPr>
-        <w:t xml:space="preserve">SERVISNÍ NABÍDKA</w:t>
+        <w:t xml:space="preserve">«nadpis»</w:t>
       </w:r>
     </w:p>
     <w:p>
@@ -32,7 +32,7 @@
           <w:sz w:val="22"/>
           <w:szCs w:val="22"/>
         </w:rPr>
-        <w:t xml:space="preserve">Servis a údržba fotovoltaické elektrárny · «popisSpecifikace»</w:t>
+        <w:t xml:space="preserve">«podnadpis»</w:t>
       </w:r>
     </w:p>
     <w:p>
@@ -54,7 +54,7 @@
         <w:rPr>
           <w:rFonts w:ascii="Calibri" w:cs="Calibri" w:eastAsia="Calibri" w:hAnsi="Calibri"/>
         </w:rPr>
-        <w:t xml:space="preserve">na základě Vaší poptávky Vám zasíláme nabídku servisu / údržby Vaší fotovoltaické elektrárny. Jsme elektrikářská firma Jurenka Elektro — elektroinstalace i fotovoltaiku děláme sami, bez zprostředkování subdodavatelů, s týmem, který se o Vás postará od diagnostiky až po opravu.</w:t>
+        <w:t xml:space="preserve">«uvod»</w:t>
       </w:r>
     </w:p>
     <w:p>
@@ -68,7 +68,7 @@
           <w:iCs/>
           <w:color w:val="5B6472"/>
         </w:rPr>
-        <w:t xml:space="preserve">[doplňte: co dalšího chcete v úvodu zmínit — zjištěná závada, rozsah prohlídky…]</w:t>
+        <w:t xml:space="preserve">[doplňte: co dalšího chcete v úvodu zmínit — zjištěná závada, stav soustavy, požadavek zákazníka…]</w:t>
       </w:r>
     </w:p>
     <w:p>
@@ -130,7 +130,7 @@
         <w:rPr>
           <w:rFonts w:ascii="Calibri" w:cs="Calibri" w:eastAsia="Calibri" w:hAnsi="Calibri"/>
         </w:rPr>
-        <w:t xml:space="preserve">Nabídku jsme připravili podle Vašeho požadavku a údajů o Vaší fotovoltaické elektrárně. Najdete v ní popis servisovaného zařízení, cenu servisu a podmínky provedení. Pokud Vám nabídka vyhovuje, stačí ji potvrdit — domluvíme termín a servis provedeme. S případnými dotazy se na nás kdykoliv obraťte.</w:t>
+        <w:t xml:space="preserve">«zpracovani»</w:t>
       </w:r>
     </w:p>
     <w:p>
@@ -151,7 +151,7 @@
           <w:sz w:val="24"/>
           <w:szCs w:val="24"/>
         </w:rPr>
-        <w:t xml:space="preserve">Specifikace servisované fotovoltaické elektrárny</w:t>
+        <w:t xml:space="preserve">«nadpisSpecifikace»</w:t>
       </w:r>
     </w:p>
     <w:tbl>
@@ -190,7 +190,7 @@
                 <w:sz w:val="20"/>
                 <w:szCs w:val="20"/>
               </w:rPr>
-              <w:t xml:space="preserve">Instalovaný výkon FVE</w:t>
+              <w:t xml:space="preserve">«#specRadky»«label»</w:t>
             </w:r>
           </w:p>
         </w:tc>
@@ -215,357 +215,7 @@
                 <w:sz w:val="20"/>
                 <w:szCs w:val="20"/>
               </w:rPr>
-              <w:t xml:space="preserve">«instalovanyVykon»</w:t>
-            </w:r>
-          </w:p>
-        </w:tc>
-      </w:tr>
-      <w:tr>
-        <w:tc>
-          <w:tcPr>
-            <w:tcW w:type="dxa" w:w="3800"/>
-            <w:tcMar>
-              <w:top w:type="dxa" w:w="90"/>
-              <w:left w:type="dxa" w:w="60"/>
-              <w:bottom w:type="dxa" w:w="90"/>
-              <w:right w:type="dxa" w:w="60"/>
-            </w:tcMar>
-            <w:vAlign w:val="center"/>
-          </w:tcPr>
-          <w:p>
-            <w:r>
-              <w:rPr>
-                <w:rFonts w:ascii="Calibri" w:cs="Calibri" w:eastAsia="Calibri" w:hAnsi="Calibri"/>
-                <w:color w:val="5B6472"/>
-                <w:sz w:val="20"/>
-                <w:szCs w:val="20"/>
-              </w:rPr>
-              <w:t xml:space="preserve">Fotovoltaické panely</w:t>
-            </w:r>
-          </w:p>
-        </w:tc>
-        <w:tc>
-          <w:tcPr>
-            <w:tcW w:type="dxa" w:w="6404"/>
-            <w:tcMar>
-              <w:top w:type="dxa" w:w="90"/>
-              <w:left w:type="dxa" w:w="60"/>
-              <w:bottom w:type="dxa" w:w="90"/>
-              <w:right w:type="dxa" w:w="60"/>
-            </w:tcMar>
-            <w:vAlign w:val="center"/>
-          </w:tcPr>
-          <w:p>
-            <w:r>
-              <w:rPr>
-                <w:rFonts w:ascii="Calibri" w:cs="Calibri" w:eastAsia="Calibri" w:hAnsi="Calibri"/>
-                <w:b/>
-                <w:bCs/>
-                <w:color w:val="1A1A1A"/>
-                <w:sz w:val="20"/>
-                <w:szCs w:val="20"/>
-              </w:rPr>
-              <w:t xml:space="preserve">«panely»</w:t>
-            </w:r>
-          </w:p>
-        </w:tc>
-      </w:tr>
-      <w:tr>
-        <w:tc>
-          <w:tcPr>
-            <w:tcW w:type="dxa" w:w="3800"/>
-            <w:tcMar>
-              <w:top w:type="dxa" w:w="90"/>
-              <w:left w:type="dxa" w:w="60"/>
-              <w:bottom w:type="dxa" w:w="90"/>
-              <w:right w:type="dxa" w:w="60"/>
-            </w:tcMar>
-            <w:vAlign w:val="center"/>
-          </w:tcPr>
-          <w:p>
-            <w:r>
-              <w:rPr>
-                <w:rFonts w:ascii="Calibri" w:cs="Calibri" w:eastAsia="Calibri" w:hAnsi="Calibri"/>
-                <w:color w:val="5B6472"/>
-                <w:sz w:val="20"/>
-                <w:szCs w:val="20"/>
-              </w:rPr>
-              <w:t xml:space="preserve">Střídač</w:t>
-            </w:r>
-          </w:p>
-        </w:tc>
-        <w:tc>
-          <w:tcPr>
-            <w:tcW w:type="dxa" w:w="6404"/>
-            <w:tcMar>
-              <w:top w:type="dxa" w:w="90"/>
-              <w:left w:type="dxa" w:w="60"/>
-              <w:bottom w:type="dxa" w:w="90"/>
-              <w:right w:type="dxa" w:w="60"/>
-            </w:tcMar>
-            <w:vAlign w:val="center"/>
-          </w:tcPr>
-          <w:p>
-            <w:r>
-              <w:rPr>
-                <w:rFonts w:ascii="Calibri" w:cs="Calibri" w:eastAsia="Calibri" w:hAnsi="Calibri"/>
-                <w:b/>
-                <w:bCs/>
-                <w:color w:val="1A1A1A"/>
-                <w:sz w:val="20"/>
-                <w:szCs w:val="20"/>
-              </w:rPr>
-              <w:t xml:space="preserve">«stridac»</w:t>
-            </w:r>
-          </w:p>
-        </w:tc>
-      </w:tr>
-      <w:tr>
-        <w:tc>
-          <w:tcPr>
-            <w:tcW w:type="dxa" w:w="3800"/>
-            <w:tcMar>
-              <w:top w:type="dxa" w:w="90"/>
-              <w:left w:type="dxa" w:w="60"/>
-              <w:bottom w:type="dxa" w:w="90"/>
-              <w:right w:type="dxa" w:w="60"/>
-            </w:tcMar>
-            <w:vAlign w:val="center"/>
-          </w:tcPr>
-          <w:p>
-            <w:r>
-              <w:rPr>
-                <w:rFonts w:ascii="Calibri" w:cs="Calibri" w:eastAsia="Calibri" w:hAnsi="Calibri"/>
-                <w:color w:val="5B6472"/>
-                <w:sz w:val="20"/>
-                <w:szCs w:val="20"/>
-              </w:rPr>
-              <w:t xml:space="preserve">Baterie</w:t>
-            </w:r>
-          </w:p>
-        </w:tc>
-        <w:tc>
-          <w:tcPr>
-            <w:tcW w:type="dxa" w:w="6404"/>
-            <w:tcMar>
-              <w:top w:type="dxa" w:w="90"/>
-              <w:left w:type="dxa" w:w="60"/>
-              <w:bottom w:type="dxa" w:w="90"/>
-              <w:right w:type="dxa" w:w="60"/>
-            </w:tcMar>
-            <w:vAlign w:val="center"/>
-          </w:tcPr>
-          <w:p>
-            <w:r>
-              <w:rPr>
-                <w:rFonts w:ascii="Calibri" w:cs="Calibri" w:eastAsia="Calibri" w:hAnsi="Calibri"/>
-                <w:b/>
-                <w:bCs/>
-                <w:color w:val="1A1A1A"/>
-                <w:sz w:val="20"/>
-                <w:szCs w:val="20"/>
-              </w:rPr>
-              <w:t xml:space="preserve">«baterie»</w:t>
-            </w:r>
-          </w:p>
-        </w:tc>
-      </w:tr>
-      <w:tr>
-        <w:tc>
-          <w:tcPr>
-            <w:tcW w:type="dxa" w:w="3800"/>
-            <w:tcMar>
-              <w:top w:type="dxa" w:w="90"/>
-              <w:left w:type="dxa" w:w="60"/>
-              <w:bottom w:type="dxa" w:w="90"/>
-              <w:right w:type="dxa" w:w="60"/>
-            </w:tcMar>
-            <w:vAlign w:val="center"/>
-          </w:tcPr>
-          <w:p>
-            <w:r>
-              <w:rPr>
-                <w:rFonts w:ascii="Calibri" w:cs="Calibri" w:eastAsia="Calibri" w:hAnsi="Calibri"/>
-                <w:color w:val="5B6472"/>
-                <w:sz w:val="20"/>
-                <w:szCs w:val="20"/>
-              </w:rPr>
-              <w:t xml:space="preserve">AC rozvaděč</w:t>
-            </w:r>
-          </w:p>
-        </w:tc>
-        <w:tc>
-          <w:tcPr>
-            <w:tcW w:type="dxa" w:w="6404"/>
-            <w:tcMar>
-              <w:top w:type="dxa" w:w="90"/>
-              <w:left w:type="dxa" w:w="60"/>
-              <w:bottom w:type="dxa" w:w="90"/>
-              <w:right w:type="dxa" w:w="60"/>
-            </w:tcMar>
-            <w:vAlign w:val="center"/>
-          </w:tcPr>
-          <w:p>
-            <w:r>
-              <w:rPr>
-                <w:rFonts w:ascii="Calibri" w:cs="Calibri" w:eastAsia="Calibri" w:hAnsi="Calibri"/>
-                <w:b/>
-                <w:bCs/>
-                <w:color w:val="1A1A1A"/>
-                <w:sz w:val="20"/>
-                <w:szCs w:val="20"/>
-              </w:rPr>
-              <w:t xml:space="preserve">«acRozvadec»</w:t>
-            </w:r>
-          </w:p>
-        </w:tc>
-      </w:tr>
-      <w:tr>
-        <w:tc>
-          <w:tcPr>
-            <w:tcW w:type="dxa" w:w="3800"/>
-            <w:tcMar>
-              <w:top w:type="dxa" w:w="90"/>
-              <w:left w:type="dxa" w:w="60"/>
-              <w:bottom w:type="dxa" w:w="90"/>
-              <w:right w:type="dxa" w:w="60"/>
-            </w:tcMar>
-            <w:vAlign w:val="center"/>
-          </w:tcPr>
-          <w:p>
-            <w:r>
-              <w:rPr>
-                <w:rFonts w:ascii="Calibri" w:cs="Calibri" w:eastAsia="Calibri" w:hAnsi="Calibri"/>
-                <w:color w:val="5B6472"/>
-                <w:sz w:val="20"/>
-                <w:szCs w:val="20"/>
-              </w:rPr>
-              <w:t xml:space="preserve">Regulace</w:t>
-            </w:r>
-          </w:p>
-        </w:tc>
-        <w:tc>
-          <w:tcPr>
-            <w:tcW w:type="dxa" w:w="6404"/>
-            <w:tcMar>
-              <w:top w:type="dxa" w:w="90"/>
-              <w:left w:type="dxa" w:w="60"/>
-              <w:bottom w:type="dxa" w:w="90"/>
-              <w:right w:type="dxa" w:w="60"/>
-            </w:tcMar>
-            <w:vAlign w:val="center"/>
-          </w:tcPr>
-          <w:p>
-            <w:r>
-              <w:rPr>
-                <w:rFonts w:ascii="Calibri" w:cs="Calibri" w:eastAsia="Calibri" w:hAnsi="Calibri"/>
-                <w:b/>
-                <w:bCs/>
-                <w:color w:val="1A1A1A"/>
-                <w:sz w:val="20"/>
-                <w:szCs w:val="20"/>
-              </w:rPr>
-              <w:t xml:space="preserve">«regulace»</w:t>
-            </w:r>
-          </w:p>
-        </w:tc>
-      </w:tr>
-      <w:tr>
-        <w:tc>
-          <w:tcPr>
-            <w:tcW w:type="dxa" w:w="3800"/>
-            <w:tcMar>
-              <w:top w:type="dxa" w:w="90"/>
-              <w:left w:type="dxa" w:w="60"/>
-              <w:bottom w:type="dxa" w:w="90"/>
-              <w:right w:type="dxa" w:w="60"/>
-            </w:tcMar>
-            <w:vAlign w:val="center"/>
-          </w:tcPr>
-          <w:p>
-            <w:r>
-              <w:rPr>
-                <w:rFonts w:ascii="Calibri" w:cs="Calibri" w:eastAsia="Calibri" w:hAnsi="Calibri"/>
-                <w:color w:val="5B6472"/>
-                <w:sz w:val="20"/>
-                <w:szCs w:val="20"/>
-              </w:rPr>
-              <w:t xml:space="preserve">Nabíjecí stanice pro EV</w:t>
-            </w:r>
-          </w:p>
-        </w:tc>
-        <w:tc>
-          <w:tcPr>
-            <w:tcW w:type="dxa" w:w="6404"/>
-            <w:tcMar>
-              <w:top w:type="dxa" w:w="90"/>
-              <w:left w:type="dxa" w:w="60"/>
-              <w:bottom w:type="dxa" w:w="90"/>
-              <w:right w:type="dxa" w:w="60"/>
-            </w:tcMar>
-            <w:vAlign w:val="center"/>
-          </w:tcPr>
-          <w:p>
-            <w:r>
-              <w:rPr>
-                <w:rFonts w:ascii="Calibri" w:cs="Calibri" w:eastAsia="Calibri" w:hAnsi="Calibri"/>
-                <w:b/>
-                <w:bCs/>
-                <w:color w:val="1A1A1A"/>
-                <w:sz w:val="20"/>
-                <w:szCs w:val="20"/>
-              </w:rPr>
-              <w:t xml:space="preserve">«nabijeciStanice»</w:t>
-            </w:r>
-          </w:p>
-        </w:tc>
-      </w:tr>
-      <w:tr>
-        <w:tc>
-          <w:tcPr>
-            <w:tcW w:type="dxa" w:w="3800"/>
-            <w:tcMar>
-              <w:top w:type="dxa" w:w="90"/>
-              <w:left w:type="dxa" w:w="60"/>
-              <w:bottom w:type="dxa" w:w="90"/>
-              <w:right w:type="dxa" w:w="60"/>
-            </w:tcMar>
-            <w:vAlign w:val="center"/>
-          </w:tcPr>
-          <w:p>
-            <w:r>
-              <w:rPr>
-                <w:rFonts w:ascii="Calibri" w:cs="Calibri" w:eastAsia="Calibri" w:hAnsi="Calibri"/>
-                <w:color w:val="5B6472"/>
-                <w:sz w:val="20"/>
-                <w:szCs w:val="20"/>
-              </w:rPr>
-              <w:t xml:space="preserve">Cena servisu / úpravy</w:t>
-            </w:r>
-          </w:p>
-        </w:tc>
-        <w:tc>
-          <w:tcPr>
-            <w:tcW w:type="dxa" w:w="6404"/>
-            <w:tcMar>
-              <w:top w:type="dxa" w:w="90"/>
-              <w:left w:type="dxa" w:w="60"/>
-              <w:bottom w:type="dxa" w:w="90"/>
-              <w:right w:type="dxa" w:w="60"/>
-            </w:tcMar>
-            <w:vAlign w:val="center"/>
-          </w:tcPr>
-          <w:p>
-            <w:r>
-              <w:rPr>
-                <w:rFonts w:ascii="Calibri" w:cs="Calibri" w:eastAsia="Calibri" w:hAnsi="Calibri"/>
-                <w:b/>
-                <w:bCs/>
-                <w:color w:val="1A1A1A"/>
-                <w:sz w:val="20"/>
-                <w:szCs w:val="20"/>
-              </w:rPr>
-              <w:t xml:space="preserve">«cenaCelkem»</w:t>
+              <w:t xml:space="preserve">«hodnota»«/specRadky»</w:t>
             </w:r>
           </w:p>
         </w:tc>
@@ -719,7 +369,7 @@
                 <w:sz w:val="20"/>
                 <w:szCs w:val="20"/>
               </w:rPr>
-              <w:t xml:space="preserve">«doplatek» z celkové ceny — po dokončení servisu a otestování funkčnosti</w:t>
+              <w:t xml:space="preserve">«doplatek» z celkové ceny — po dokončení prací a otestování funkčnosti</w:t>
             </w:r>
           </w:p>
         </w:tc>
@@ -947,7 +597,7 @@
         <w:rPr>
           <w:rFonts w:ascii="Calibri" w:cs="Calibri" w:eastAsia="Calibri" w:hAnsi="Calibri"/>
         </w:rPr>
-        <w:t xml:space="preserve">Servis provedeme do «terminProvedeni» od odsouhlasení nabídky.</w:t>
+        <w:t xml:space="preserve">Práce provedeme do «terminProvedeni» od odsouhlasení nabídky.</w:t>
       </w:r>
     </w:p>
     <w:p>
@@ -1061,7 +711,7 @@
                 <w:sz w:val="18"/>
                 <w:szCs w:val="18"/>
               </w:rPr>
-              <w:t xml:space="preserve">Nově dodaný / vyměněný materiál</w:t>
+              <w:t xml:space="preserve">Dodaný materiál a komponenty</w:t>
             </w:r>
           </w:p>
         </w:tc>
@@ -1110,7 +760,7 @@
                 <w:sz w:val="18"/>
                 <w:szCs w:val="18"/>
               </w:rPr>
-              <w:t xml:space="preserve">Provedená servisní práce</w:t>
+              <w:t xml:space="preserve">Provedená práce</w:t>
             </w:r>
           </w:p>
         </w:tc>
@@ -1164,7 +814,7 @@
           <w:sz w:val="24"/>
           <w:szCs w:val="24"/>
         </w:rPr>
-        <w:t xml:space="preserve">Jak probíhá servis s Jurenka Elektro</w:t>
+        <w:t xml:space="preserve">«nadpisPostup»</w:t>
       </w:r>
     </w:p>
     <w:tbl>
@@ -1280,7 +930,7 @@
                 <w:sz w:val="18"/>
                 <w:szCs w:val="18"/>
               </w:rPr>
-              <w:t xml:space="preserve">Nahlášení požadavku a domluva termínu</w:t>
+              <w:t xml:space="preserve">«krok1»</w:t>
             </w:r>
           </w:p>
         </w:tc>
@@ -1428,7 +1078,7 @@
                 <w:sz w:val="18"/>
                 <w:szCs w:val="18"/>
               </w:rPr>
-              <w:t xml:space="preserve">Diagnostika nebo prohlídka na místě</w:t>
+              <w:t xml:space="preserve">«krok2»</w:t>
             </w:r>
           </w:p>
         </w:tc>
@@ -1576,7 +1226,7 @@
                 <w:sz w:val="18"/>
                 <w:szCs w:val="18"/>
               </w:rPr>
-              <w:t xml:space="preserve">Nabídka na servis (tento dokument)</w:t>
+              <w:t xml:space="preserve">«krok3»</w:t>
             </w:r>
           </w:p>
         </w:tc>
@@ -1724,7 +1374,7 @@
                 <w:sz w:val="18"/>
                 <w:szCs w:val="18"/>
               </w:rPr>
-              <w:t xml:space="preserve">Odsouhlasení nabídky</w:t>
+              <w:t xml:space="preserve">«krok4»</w:t>
             </w:r>
           </w:p>
         </w:tc>
@@ -1872,7 +1522,7 @@
                 <w:sz w:val="18"/>
                 <w:szCs w:val="18"/>
               </w:rPr>
-              <w:t xml:space="preserve">Provedení servisu a předání</w:t>
+              <w:t xml:space="preserve">«krok5»</w:t>
             </w:r>
           </w:p>
         </w:tc>

</xml_diff>

<commit_message>
Servisni nabidka: jasne uvedene ukony a sloupec Pocet ks ve specifikaci
- SRV: misto zaskrtavatek editor ukonu "Co se bude provadet" - rychle
  pridani Revize / Diagnostika / Cisteni FVE panelu s predvyplnenym
  popisem (upravitelnym) a "+ Vlastni ukon". V nabidce novy zvyrazneny
  ramecek "Co pro Vas provedeme" s nazvem a popisem kazdeho ukonu,
  ukony jsou i v podnadpisu a uvodu.
- Pojistka: bez zadaneho ukonu kalkulacka cervene upozorni a pred
  vygenerovanim nabidky se zepta.
- Specifikace (servis i rozsireni) ma tri sloupce: Polozka / Typ /
  Pocet ks.
- Starsi nabidky se zaskrtnutym "druhem servisu" se na ukony prevedou.

Co-Authored-By: Claude Opus 5.5 <noreply@anthropic.com>
Claude-Session: https://claude.ai/code/session_01HHfPVFWLgp3FgnzVf81wm5
</commit_message>
<xml_diff>
--- a/public/templates/nabidka_servis_sablona.docx
+++ b/public/templates/nabidka_servis_sablona.docx
@@ -99,6 +99,131 @@
           <w:szCs w:val="18"/>
         </w:rPr>
         <w:t xml:space="preserve">«tvarEmailOZ»   ·   «tvarTelefonOZ»</w:t>
+      </w:r>
+    </w:p>
+    <w:p>
+      <w:r>
+        <w:rPr>
+          <w:rFonts w:ascii="Calibri" w:cs="Calibri" w:eastAsia="Calibri" w:hAnsi="Calibri"/>
+          <w:sz w:val="18"/>
+          <w:szCs w:val="18"/>
+        </w:rPr>
+        <w:t xml:space="preserve">«#maUkony»</w:t>
+      </w:r>
+    </w:p>
+    <w:p>
+      <w:pPr>
+        <w:keepNext/>
+        <w:keepLines/>
+        <w:pBdr>
+          <w:bottom w:val="single" w:color="E08A1E" w:sz="6" w:space="4"/>
+        </w:pBdr>
+        <w:spacing w:after="140" w:before="320"/>
+      </w:pPr>
+      <w:r>
+        <w:rPr>
+          <w:rFonts w:ascii="Calibri" w:cs="Calibri" w:eastAsia="Calibri" w:hAnsi="Calibri"/>
+          <w:b/>
+          <w:bCs/>
+          <w:color w:val="16324F"/>
+          <w:sz w:val="24"/>
+          <w:szCs w:val="24"/>
+        </w:rPr>
+        <w:t xml:space="preserve">Co pro Vás provedeme</w:t>
+      </w:r>
+    </w:p>
+    <w:tbl>
+      <w:tblPr>
+        <w:tblW w:type="dxa" w:w="10204"/>
+        <w:tblBorders>
+          <w:top w:val="none"/>
+          <w:left w:val="single" w:color="E08A1E" w:sz="24"/>
+          <w:bottom w:val="none"/>
+          <w:right w:val="none"/>
+          <w:insideH w:val="none"/>
+          <w:insideV w:val="none"/>
+        </w:tblBorders>
+      </w:tblPr>
+      <w:tblGrid>
+        <w:gridCol w:w="10204"/>
+      </w:tblGrid>
+      <w:tr>
+        <w:trPr>
+          <w:cantSplit/>
+        </w:trPr>
+        <w:tc>
+          <w:tcPr>
+            <w:tcW w:type="dxa" w:w="10204"/>
+            <w:shd w:fill="EEF5FB" w:val="clear"/>
+            <w:tcMar>
+              <w:top w:type="dxa" w:w="120"/>
+              <w:left w:type="dxa" w:w="200"/>
+              <w:bottom w:type="dxa" w:w="60"/>
+              <w:right w:type="dxa" w:w="160"/>
+            </w:tcMar>
+          </w:tcPr>
+          <w:p>
+            <w:r>
+              <w:rPr>
+                <w:rFonts w:ascii="Calibri" w:cs="Calibri" w:eastAsia="Calibri" w:hAnsi="Calibri"/>
+                <w:sz w:val="18"/>
+                <w:szCs w:val="18"/>
+              </w:rPr>
+              <w:t xml:space="preserve">«#ukony»</w:t>
+            </w:r>
+          </w:p>
+          <w:p>
+            <w:pPr>
+              <w:keepNext/>
+              <w:spacing w:after="20"/>
+            </w:pPr>
+            <w:r>
+              <w:rPr>
+                <w:rFonts w:ascii="Calibri" w:cs="Calibri" w:eastAsia="Calibri" w:hAnsi="Calibri"/>
+                <w:b/>
+                <w:bCs/>
+                <w:color w:val="16324F"/>
+                <w:sz w:val="22"/>
+                <w:szCs w:val="22"/>
+              </w:rPr>
+              <w:t xml:space="preserve">«nazev»</w:t>
+            </w:r>
+          </w:p>
+          <w:p>
+            <w:pPr>
+              <w:spacing w:after="120" w:line="280"/>
+            </w:pPr>
+            <w:r>
+              <w:rPr>
+                <w:rFonts w:ascii="Calibri" w:cs="Calibri" w:eastAsia="Calibri" w:hAnsi="Calibri"/>
+                <w:color w:val="1A1A1A"/>
+                <w:sz w:val="20"/>
+                <w:szCs w:val="20"/>
+              </w:rPr>
+              <w:t xml:space="preserve">«popis»</w:t>
+            </w:r>
+          </w:p>
+          <w:p>
+            <w:r>
+              <w:rPr>
+                <w:rFonts w:ascii="Calibri" w:cs="Calibri" w:eastAsia="Calibri" w:hAnsi="Calibri"/>
+                <w:sz w:val="18"/>
+                <w:szCs w:val="18"/>
+              </w:rPr>
+              <w:t xml:space="preserve">«/ukony»</w:t>
+            </w:r>
+          </w:p>
+        </w:tc>
+      </w:tr>
+    </w:tbl>
+    <w:p>
+      <w:r>
+        <w:rPr>
+          <w:rFonts w:ascii="Calibri" w:cs="Calibri" w:eastAsia="Calibri" w:hAnsi="Calibri"/>
+          <w:sz w:val="18"/>
+          <w:szCs w:val="18"/>
+        </w:rPr>
+        <w:t xml:space="preserve">«/maUkony»</w:t>
       </w:r>
     </w:p>
     <w:p>
@@ -167,13 +292,97 @@
         </w:tblBorders>
       </w:tblPr>
       <w:tblGrid>
-        <w:gridCol w:w="3800"/>
-        <w:gridCol w:w="6404"/>
+        <w:gridCol w:w="3000"/>
+        <w:gridCol w:w="5504"/>
+        <w:gridCol w:w="1700"/>
       </w:tblGrid>
+      <w:tr>
+        <w:trPr>
+          <w:tblHeader/>
+        </w:trPr>
+        <w:tc>
+          <w:tcPr>
+            <w:tcW w:type="dxa" w:w="3000"/>
+            <w:tcMar>
+              <w:top w:type="dxa" w:w="60"/>
+              <w:left w:type="dxa" w:w="60"/>
+              <w:bottom w:type="dxa" w:w="60"/>
+              <w:right w:type="dxa" w:w="60"/>
+            </w:tcMar>
+            <w:vAlign w:val="center"/>
+          </w:tcPr>
+          <w:p>
+            <w:r>
+              <w:rPr>
+                <w:rFonts w:ascii="Calibri" w:cs="Calibri" w:eastAsia="Calibri" w:hAnsi="Calibri"/>
+                <w:b/>
+                <w:bCs/>
+                <w:color w:val="5B6472"/>
+                <w:sz w:val="16"/>
+                <w:szCs w:val="16"/>
+              </w:rPr>
+              <w:t xml:space="preserve">POLOŽKA</w:t>
+            </w:r>
+          </w:p>
+        </w:tc>
+        <w:tc>
+          <w:tcPr>
+            <w:tcW w:type="dxa" w:w="5504"/>
+            <w:tcMar>
+              <w:top w:type="dxa" w:w="60"/>
+              <w:left w:type="dxa" w:w="60"/>
+              <w:bottom w:type="dxa" w:w="60"/>
+              <w:right w:type="dxa" w:w="60"/>
+            </w:tcMar>
+            <w:vAlign w:val="center"/>
+          </w:tcPr>
+          <w:p>
+            <w:r>
+              <w:rPr>
+                <w:rFonts w:ascii="Calibri" w:cs="Calibri" w:eastAsia="Calibri" w:hAnsi="Calibri"/>
+                <w:b/>
+                <w:bCs/>
+                <w:color w:val="5B6472"/>
+                <w:sz w:val="16"/>
+                <w:szCs w:val="16"/>
+              </w:rPr>
+              <w:t xml:space="preserve">TYP / POPIS</w:t>
+            </w:r>
+          </w:p>
+        </w:tc>
+        <w:tc>
+          <w:tcPr>
+            <w:tcW w:type="dxa" w:w="1700"/>
+            <w:tcMar>
+              <w:top w:type="dxa" w:w="60"/>
+              <w:left w:type="dxa" w:w="60"/>
+              <w:bottom w:type="dxa" w:w="60"/>
+              <w:right w:type="dxa" w:w="60"/>
+            </w:tcMar>
+            <w:vAlign w:val="center"/>
+          </w:tcPr>
+          <w:p>
+            <w:pPr>
+              <w:jc w:val="center"/>
+            </w:pPr>
+            <w:r>
+              <w:rPr>
+                <w:rFonts w:ascii="Calibri" w:cs="Calibri" w:eastAsia="Calibri" w:hAnsi="Calibri"/>
+                <w:b/>
+                <w:bCs/>
+                <w:color w:val="5B6472"/>
+                <w:sz w:val="16"/>
+                <w:szCs w:val="16"/>
+              </w:rPr>
+              <w:t xml:space="preserve">POČET KS</w:t>
+            </w:r>
+          </w:p>
+        </w:tc>
+      </w:tr>
       <w:tr>
         <w:tc>
           <w:tcPr>
-            <w:tcW w:type="dxa" w:w="3800"/>
+            <w:tcW w:type="dxa" w:w="3000"/>
             <w:tcMar>
               <w:top w:type="dxa" w:w="90"/>
               <w:left w:type="dxa" w:w="60"/>
@@ -186,6 +395,8 @@
             <w:r>
               <w:rPr>
                 <w:rFonts w:ascii="Calibri" w:cs="Calibri" w:eastAsia="Calibri" w:hAnsi="Calibri"/>
+                <w:b w:val="false"/>
+                <w:bCs w:val="false"/>
                 <w:color w:val="5B6472"/>
                 <w:sz w:val="20"/>
                 <w:szCs w:val="20"/>
@@ -196,7 +407,7 @@
         </w:tc>
         <w:tc>
           <w:tcPr>
-            <w:tcW w:type="dxa" w:w="6404"/>
+            <w:tcW w:type="dxa" w:w="5504"/>
             <w:tcMar>
               <w:top w:type="dxa" w:w="90"/>
               <w:left w:type="dxa" w:w="60"/>
@@ -215,7 +426,35 @@
                 <w:sz w:val="20"/>
                 <w:szCs w:val="20"/>
               </w:rPr>
-              <w:t xml:space="preserve">«hodnota»«/specRadky»</w:t>
+              <w:t xml:space="preserve">«hodnota»</w:t>
+            </w:r>
+          </w:p>
+        </w:tc>
+        <w:tc>
+          <w:tcPr>
+            <w:tcW w:type="dxa" w:w="1700"/>
+            <w:tcMar>
+              <w:top w:type="dxa" w:w="90"/>
+              <w:left w:type="dxa" w:w="60"/>
+              <w:bottom w:type="dxa" w:w="90"/>
+              <w:right w:type="dxa" w:w="60"/>
+            </w:tcMar>
+            <w:vAlign w:val="center"/>
+          </w:tcPr>
+          <w:p>
+            <w:pPr>
+              <w:jc w:val="center"/>
+            </w:pPr>
+            <w:r>
+              <w:rPr>
+                <w:rFonts w:ascii="Calibri" w:cs="Calibri" w:eastAsia="Calibri" w:hAnsi="Calibri"/>
+                <w:b/>
+                <w:bCs/>
+                <w:color w:val="1A1A1A"/>
+                <w:sz w:val="20"/>
+                <w:szCs w:val="20"/>
+              </w:rPr>
+              <w:t xml:space="preserve">«ks»«/specRadky»</w:t>
             </w:r>
           </w:p>
         </w:tc>

</xml_diff>

<commit_message>
Nabidka SRV/FVR: sloupec Pocet ks pred Typ / popis ve specifikaci
Co-Authored-By: Claude Opus 5.5 <noreply@anthropic.com>
Claude-Session: https://claude.ai/code/session_01HHfPVFWLgp3FgnzVf81wm5
</commit_message>
<xml_diff>
--- a/public/templates/nabidka_servis_sablona.docx
+++ b/public/templates/nabidka_servis_sablona.docx
@@ -293,8 +293,8 @@
       </w:tblPr>
       <w:tblGrid>
         <w:gridCol w:w="3000"/>
-        <w:gridCol w:w="5504"/>
-        <w:gridCol w:w="1700"/>
+        <w:gridCol w:w="1300"/>
+        <w:gridCol w:w="5904"/>
       </w:tblGrid>
       <w:tr>
         <w:trPr>
@@ -327,7 +327,7 @@
         </w:tc>
         <w:tc>
           <w:tcPr>
-            <w:tcW w:type="dxa" w:w="5504"/>
+            <w:tcW w:type="dxa" w:w="1300"/>
             <w:tcMar>
               <w:top w:type="dxa" w:w="60"/>
               <w:left w:type="dxa" w:w="60"/>
@@ -337,6 +337,9 @@
             <w:vAlign w:val="center"/>
           </w:tcPr>
           <w:p>
+            <w:pPr>
+              <w:jc w:val="center"/>
+            </w:pPr>
             <w:r>
               <w:rPr>
                 <w:rFonts w:ascii="Calibri" w:cs="Calibri" w:eastAsia="Calibri" w:hAnsi="Calibri"/>
@@ -346,13 +349,13 @@
                 <w:sz w:val="16"/>
                 <w:szCs w:val="16"/>
               </w:rPr>
-              <w:t xml:space="preserve">TYP / POPIS</w:t>
+              <w:t xml:space="preserve">POČET KS</w:t>
             </w:r>
           </w:p>
         </w:tc>
         <w:tc>
           <w:tcPr>
-            <w:tcW w:type="dxa" w:w="1700"/>
+            <w:tcW w:type="dxa" w:w="5904"/>
             <w:tcMar>
               <w:top w:type="dxa" w:w="60"/>
               <w:left w:type="dxa" w:w="60"/>
@@ -362,9 +365,6 @@
             <w:vAlign w:val="center"/>
           </w:tcPr>
           <w:p>
-            <w:pPr>
-              <w:jc w:val="center"/>
-            </w:pPr>
             <w:r>
               <w:rPr>
                 <w:rFonts w:ascii="Calibri" w:cs="Calibri" w:eastAsia="Calibri" w:hAnsi="Calibri"/>
@@ -374,7 +374,7 @@
                 <w:sz w:val="16"/>
                 <w:szCs w:val="16"/>
               </w:rPr>
-              <w:t xml:space="preserve">POČET KS</w:t>
+              <w:t xml:space="preserve">TYP / POPIS</w:t>
             </w:r>
           </w:p>
         </w:tc>
@@ -407,7 +407,7 @@
         </w:tc>
         <w:tc>
           <w:tcPr>
-            <w:tcW w:type="dxa" w:w="5504"/>
+            <w:tcW w:type="dxa" w:w="1300"/>
             <w:tcMar>
               <w:top w:type="dxa" w:w="90"/>
               <w:left w:type="dxa" w:w="60"/>
@@ -417,6 +417,9 @@
             <w:vAlign w:val="center"/>
           </w:tcPr>
           <w:p>
+            <w:pPr>
+              <w:jc w:val="center"/>
+            </w:pPr>
             <w:r>
               <w:rPr>
                 <w:rFonts w:ascii="Calibri" w:cs="Calibri" w:eastAsia="Calibri" w:hAnsi="Calibri"/>
@@ -426,13 +429,13 @@
                 <w:sz w:val="20"/>
                 <w:szCs w:val="20"/>
               </w:rPr>
-              <w:t xml:space="preserve">«hodnota»</w:t>
+              <w:t xml:space="preserve">«ks»</w:t>
             </w:r>
           </w:p>
         </w:tc>
         <w:tc>
           <w:tcPr>
-            <w:tcW w:type="dxa" w:w="1700"/>
+            <w:tcW w:type="dxa" w:w="5904"/>
             <w:tcMar>
               <w:top w:type="dxa" w:w="90"/>
               <w:left w:type="dxa" w:w="60"/>
@@ -442,9 +445,6 @@
             <w:vAlign w:val="center"/>
           </w:tcPr>
           <w:p>
-            <w:pPr>
-              <w:jc w:val="center"/>
-            </w:pPr>
             <w:r>
               <w:rPr>
                 <w:rFonts w:ascii="Calibri" w:cs="Calibri" w:eastAsia="Calibri" w:hAnsi="Calibri"/>
@@ -454,7 +454,7 @@
                 <w:sz w:val="20"/>
                 <w:szCs w:val="20"/>
               </w:rPr>
-              <w:t xml:space="preserve">«ks»«/specRadky»</w:t>
+              <w:t xml:space="preserve">«hodnota»«/specRadky»</w:t>
             </w:r>
           </w:p>
         </w:tc>

</xml_diff>

<commit_message>
Servisni nabidka: "Co pro Vas provedeme" jako tabulka ve stylu specifikace
Misto modreho ramecku maji ukony stejnou tabulku jako specifikace
(Ukon | Pocet ks | Popis). U kazdeho ukonu v kalkulacce pribylo
nepovinne pole Pocet ks. Nabidka rozsireni beze zmeny.

Co-Authored-By: Claude Opus 5.5 <noreply@anthropic.com>
Claude-Session: https://claude.ai/code/session_01HHfPVFWLgp3FgnzVf81wm5
</commit_message>
<xml_diff>
--- a/public/templates/nabidka_servis_sablona.docx
+++ b/public/templates/nabidka_servis_sablona.docx
@@ -137,80 +137,177 @@
         <w:tblW w:type="dxa" w:w="10204"/>
         <w:tblBorders>
           <w:top w:val="none"/>
-          <w:left w:val="single" w:color="E08A1E" w:sz="24"/>
+          <w:left w:val="none"/>
           <w:bottom w:val="none"/>
           <w:right w:val="none"/>
-          <w:insideH w:val="none"/>
+          <w:insideH w:val="single" w:color="D9D9D9" w:sz="2"/>
           <w:insideV w:val="none"/>
         </w:tblBorders>
       </w:tblPr>
       <w:tblGrid>
-        <w:gridCol w:w="10204"/>
+        <w:gridCol w:w="3000"/>
+        <w:gridCol w:w="1300"/>
+        <w:gridCol w:w="5904"/>
       </w:tblGrid>
       <w:tr>
         <w:trPr>
-          <w:cantSplit/>
+          <w:tblHeader/>
         </w:trPr>
         <w:tc>
           <w:tcPr>
-            <w:tcW w:type="dxa" w:w="10204"/>
-            <w:shd w:fill="EEF5FB" w:val="clear"/>
-            <w:tcMar>
-              <w:top w:type="dxa" w:w="120"/>
-              <w:left w:type="dxa" w:w="200"/>
+            <w:tcW w:type="dxa" w:w="3000"/>
+            <w:tcMar>
+              <w:top w:type="dxa" w:w="60"/>
+              <w:left w:type="dxa" w:w="60"/>
               <w:bottom w:type="dxa" w:w="60"/>
-              <w:right w:type="dxa" w:w="160"/>
-            </w:tcMar>
-          </w:tcPr>
-          <w:p>
-            <w:r>
-              <w:rPr>
-                <w:rFonts w:ascii="Calibri" w:cs="Calibri" w:eastAsia="Calibri" w:hAnsi="Calibri"/>
-                <w:sz w:val="18"/>
-                <w:szCs w:val="18"/>
-              </w:rPr>
-              <w:t xml:space="preserve">«#ukony»</w:t>
-            </w:r>
-          </w:p>
-          <w:p>
-            <w:pPr>
-              <w:keepNext/>
-              <w:spacing w:after="20"/>
-            </w:pPr>
+              <w:right w:type="dxa" w:w="60"/>
+            </w:tcMar>
+            <w:vAlign w:val="center"/>
+          </w:tcPr>
+          <w:p>
             <w:r>
               <w:rPr>
                 <w:rFonts w:ascii="Calibri" w:cs="Calibri" w:eastAsia="Calibri" w:hAnsi="Calibri"/>
                 <w:b/>
                 <w:bCs/>
-                <w:color w:val="16324F"/>
-                <w:sz w:val="22"/>
-                <w:szCs w:val="22"/>
-              </w:rPr>
-              <w:t xml:space="preserve">«nazev»</w:t>
-            </w:r>
-          </w:p>
+                <w:color w:val="5B6472"/>
+                <w:sz w:val="16"/>
+                <w:szCs w:val="16"/>
+              </w:rPr>
+              <w:t xml:space="preserve">ÚKON</w:t>
+            </w:r>
+          </w:p>
+        </w:tc>
+        <w:tc>
+          <w:tcPr>
+            <w:tcW w:type="dxa" w:w="1300"/>
+            <w:tcMar>
+              <w:top w:type="dxa" w:w="60"/>
+              <w:left w:type="dxa" w:w="60"/>
+              <w:bottom w:type="dxa" w:w="60"/>
+              <w:right w:type="dxa" w:w="60"/>
+            </w:tcMar>
+            <w:vAlign w:val="center"/>
+          </w:tcPr>
           <w:p>
             <w:pPr>
-              <w:spacing w:after="120" w:line="280"/>
+              <w:jc w:val="center"/>
             </w:pPr>
             <w:r>
               <w:rPr>
                 <w:rFonts w:ascii="Calibri" w:cs="Calibri" w:eastAsia="Calibri" w:hAnsi="Calibri"/>
+                <w:b/>
+                <w:bCs/>
+                <w:color w:val="5B6472"/>
+                <w:sz w:val="16"/>
+                <w:szCs w:val="16"/>
+              </w:rPr>
+              <w:t xml:space="preserve">POČET KS</w:t>
+            </w:r>
+          </w:p>
+        </w:tc>
+        <w:tc>
+          <w:tcPr>
+            <w:tcW w:type="dxa" w:w="5904"/>
+            <w:tcMar>
+              <w:top w:type="dxa" w:w="60"/>
+              <w:left w:type="dxa" w:w="60"/>
+              <w:bottom w:type="dxa" w:w="60"/>
+              <w:right w:type="dxa" w:w="60"/>
+            </w:tcMar>
+            <w:vAlign w:val="center"/>
+          </w:tcPr>
+          <w:p>
+            <w:r>
+              <w:rPr>
+                <w:rFonts w:ascii="Calibri" w:cs="Calibri" w:eastAsia="Calibri" w:hAnsi="Calibri"/>
+                <w:b/>
+                <w:bCs/>
+                <w:color w:val="5B6472"/>
+                <w:sz w:val="16"/>
+                <w:szCs w:val="16"/>
+              </w:rPr>
+              <w:t xml:space="preserve">POPIS</w:t>
+            </w:r>
+          </w:p>
+        </w:tc>
+      </w:tr>
+      <w:tr>
+        <w:tc>
+          <w:tcPr>
+            <w:tcW w:type="dxa" w:w="3000"/>
+            <w:tcMar>
+              <w:top w:type="dxa" w:w="90"/>
+              <w:left w:type="dxa" w:w="60"/>
+              <w:bottom w:type="dxa" w:w="90"/>
+              <w:right w:type="dxa" w:w="60"/>
+            </w:tcMar>
+            <w:vAlign w:val="center"/>
+          </w:tcPr>
+          <w:p>
+            <w:r>
+              <w:rPr>
+                <w:rFonts w:ascii="Calibri" w:cs="Calibri" w:eastAsia="Calibri" w:hAnsi="Calibri"/>
+                <w:b w:val="false"/>
+                <w:bCs w:val="false"/>
+                <w:color w:val="5B6472"/>
+                <w:sz w:val="20"/>
+                <w:szCs w:val="20"/>
+              </w:rPr>
+              <w:t xml:space="preserve">«#ukony»«nazev»</w:t>
+            </w:r>
+          </w:p>
+        </w:tc>
+        <w:tc>
+          <w:tcPr>
+            <w:tcW w:type="dxa" w:w="1300"/>
+            <w:tcMar>
+              <w:top w:type="dxa" w:w="90"/>
+              <w:left w:type="dxa" w:w="60"/>
+              <w:bottom w:type="dxa" w:w="90"/>
+              <w:right w:type="dxa" w:w="60"/>
+            </w:tcMar>
+            <w:vAlign w:val="center"/>
+          </w:tcPr>
+          <w:p>
+            <w:pPr>
+              <w:jc w:val="center"/>
+            </w:pPr>
+            <w:r>
+              <w:rPr>
+                <w:rFonts w:ascii="Calibri" w:cs="Calibri" w:eastAsia="Calibri" w:hAnsi="Calibri"/>
+                <w:b/>
+                <w:bCs/>
                 <w:color w:val="1A1A1A"/>
                 <w:sz w:val="20"/>
                 <w:szCs w:val="20"/>
               </w:rPr>
-              <w:t xml:space="preserve">«popis»</w:t>
-            </w:r>
-          </w:p>
-          <w:p>
-            <w:r>
-              <w:rPr>
-                <w:rFonts w:ascii="Calibri" w:cs="Calibri" w:eastAsia="Calibri" w:hAnsi="Calibri"/>
-                <w:sz w:val="18"/>
-                <w:szCs w:val="18"/>
-              </w:rPr>
-              <w:t xml:space="preserve">«/ukony»</w:t>
+              <w:t xml:space="preserve">«ks»</w:t>
+            </w:r>
+          </w:p>
+        </w:tc>
+        <w:tc>
+          <w:tcPr>
+            <w:tcW w:type="dxa" w:w="5904"/>
+            <w:tcMar>
+              <w:top w:type="dxa" w:w="90"/>
+              <w:left w:type="dxa" w:w="60"/>
+              <w:bottom w:type="dxa" w:w="90"/>
+              <w:right w:type="dxa" w:w="60"/>
+            </w:tcMar>
+            <w:vAlign w:val="center"/>
+          </w:tcPr>
+          <w:p>
+            <w:r>
+              <w:rPr>
+                <w:rFonts w:ascii="Calibri" w:cs="Calibri" w:eastAsia="Calibri" w:hAnsi="Calibri"/>
+                <w:b/>
+                <w:bCs/>
+                <w:color w:val="1A1A1A"/>
+                <w:sz w:val="20"/>
+                <w:szCs w:val="20"/>
+              </w:rPr>
+              <w:t xml:space="preserve">«popis»«/ukony»</w:t>
             </w:r>
           </w:p>
         </w:tc>

</xml_diff>